<commit_message>
第六週第2節：第12張補 Rate Noise Density 與 Unmanned and autonomous vehicles 的說明
- 備忘稿：雜訊密度＝讀數忽上忽下的程度，和零偏的差別（體重計例子）；Applications 那一欄翻成無人載具與自駕載具
- 講義 IMU 對照表加雜訊密度一列、術語表加一條；中越兩版與 PDF 重產

Co-Authored-By: Claude Opus 5.5 <noreply@anthropic.com>
</commit_message>
<xml_diff>
--- a/第六週(10-15)/Nguyên lý xe tự lái_Tuần 6_Tài liệu học tập.docx
+++ b/第六週(10-15)/Nguyên lý xe tự lái_Tuần 6_Tài liệu học tập.docx
@@ -7023,6 +7023,124 @@
                 <w:szCs w:val="18"/>
               </w:rPr>
               <w:t xml:space="preserve">Sai số góc do nhiễu tích luỹ, tăng theo căn bậc hai thời gian</w:t>
+            </w:r>
+          </w:p>
+        </w:tc>
+      </w:tr>
+      <w:tr>
+        <w:trPr>
+          <w:cantSplit/>
+          <w:tblHeader w:val="false"/>
+        </w:trPr>
+        <w:tc>
+          <w:tcPr>
+            <w:tcW w:type="dxa" w:w="2900"/>
+            <w:tcMar>
+              <w:top w:type="dxa" w:w="60"/>
+              <w:left w:type="dxa" w:w="95"/>
+              <w:bottom w:type="dxa" w:w="60"/>
+              <w:right w:type="dxa" w:w="95"/>
+            </w:tcMar>
+            <w:vAlign w:val="center"/>
+          </w:tcPr>
+          <w:p>
+            <w:pPr>
+              <w:spacing w:after="0" w:line="265"/>
+            </w:pPr>
+            <w:r>
+              <w:rPr>
+                <w:rFonts w:ascii="Arial" w:cs="Arial" w:eastAsia="Arial" w:hAnsi="Arial"/>
+                <w:b w:val="false"/>
+                <w:bCs w:val="false"/>
+                <w:color w:val="1B1B1B"/>
+                <w:sz w:val="18"/>
+                <w:szCs w:val="18"/>
+              </w:rPr>
+              <w:t xml:space="preserve">Rate Noise Density (mật độ nhiễu)</w:t>
+            </w:r>
+          </w:p>
+        </w:tc>
+        <w:tc>
+          <w:tcPr>
+            <w:tcW w:type="dxa" w:w="2050"/>
+            <w:tcMar>
+              <w:top w:type="dxa" w:w="60"/>
+              <w:left w:type="dxa" w:w="95"/>
+              <w:bottom w:type="dxa" w:w="60"/>
+              <w:right w:type="dxa" w:w="95"/>
+            </w:tcMar>
+            <w:vAlign w:val="center"/>
+          </w:tcPr>
+          <w:p>
+            <w:pPr>
+              <w:spacing w:after="0" w:line="265"/>
+            </w:pPr>
+            <w:r>
+              <w:rPr>
+                <w:rFonts w:ascii="Arial" w:cs="Arial" w:eastAsia="Arial" w:hAnsi="Arial"/>
+                <w:b w:val="false"/>
+                <w:bCs w:val="false"/>
+                <w:color w:val="1B1B1B"/>
+                <w:sz w:val="18"/>
+                <w:szCs w:val="18"/>
+              </w:rPr>
+              <w:t xml:space="preserve">0,015 °/s/√Hz</w:t>
+            </w:r>
+          </w:p>
+        </w:tc>
+        <w:tc>
+          <w:tcPr>
+            <w:tcW w:type="dxa" w:w="2050"/>
+            <w:tcMar>
+              <w:top w:type="dxa" w:w="60"/>
+              <w:left w:type="dxa" w:w="95"/>
+              <w:bottom w:type="dxa" w:w="60"/>
+              <w:right w:type="dxa" w:w="95"/>
+            </w:tcMar>
+            <w:vAlign w:val="center"/>
+          </w:tcPr>
+          <w:p>
+            <w:pPr>
+              <w:spacing w:after="0" w:line="265"/>
+            </w:pPr>
+            <w:r>
+              <w:rPr>
+                <w:rFonts w:ascii="Arial" w:cs="Arial" w:eastAsia="Arial" w:hAnsi="Arial"/>
+                <w:b w:val="false"/>
+                <w:bCs w:val="false"/>
+                <w:color w:val="1B1B1B"/>
+                <w:sz w:val="18"/>
+                <w:szCs w:val="18"/>
+              </w:rPr>
+              <w:t xml:space="preserve">0,008 °/s/√Hz</w:t>
+            </w:r>
+          </w:p>
+        </w:tc>
+        <w:tc>
+          <w:tcPr>
+            <w:tcW w:type="dxa" w:w="2360"/>
+            <w:tcMar>
+              <w:top w:type="dxa" w:w="60"/>
+              <w:left w:type="dxa" w:w="95"/>
+              <w:bottom w:type="dxa" w:w="60"/>
+              <w:right w:type="dxa" w:w="95"/>
+            </w:tcMar>
+            <w:vAlign w:val="center"/>
+          </w:tcPr>
+          <w:p>
+            <w:pPr>
+              <w:spacing w:after="0" w:line="265"/>
+            </w:pPr>
+            <w:r>
+              <w:rPr>
+                <w:rFonts w:ascii="Arial" w:cs="Arial" w:eastAsia="Arial" w:hAnsi="Arial"/>
+                <w:b w:val="false"/>
+                <w:bCs w:val="false"/>
+                <w:color w:val="1B1B1B"/>
+                <w:sz w:val="18"/>
+                <w:szCs w:val="18"/>
+              </w:rPr>
+              <w:t xml:space="preserve">Mức số đọc nhảy lên xuống; lệch không trừ được trước, nhiễu thì không trừ được, chỉ lấy trung bình</w:t>
             </w:r>
           </w:p>
         </w:tc>
@@ -13179,6 +13297,96 @@
                 <w:szCs w:val="18"/>
               </w:rPr>
               <w:t xml:space="preserve">Độ ổn định lệch</w:t>
+            </w:r>
+          </w:p>
+        </w:tc>
+      </w:tr>
+      <w:tr>
+        <w:trPr>
+          <w:cantSplit/>
+          <w:tblHeader w:val="false"/>
+        </w:trPr>
+        <w:tc>
+          <w:tcPr>
+            <w:tcW w:type="dxa" w:w="3200"/>
+            <w:tcMar>
+              <w:top w:type="dxa" w:w="60"/>
+              <w:left w:type="dxa" w:w="95"/>
+              <w:bottom w:type="dxa" w:w="60"/>
+              <w:right w:type="dxa" w:w="95"/>
+            </w:tcMar>
+            <w:vAlign w:val="center"/>
+          </w:tcPr>
+          <w:p>
+            <w:pPr>
+              <w:spacing w:after="0" w:line="265"/>
+            </w:pPr>
+            <w:r>
+              <w:rPr>
+                <w:rFonts w:ascii="Arial" w:cs="Arial" w:eastAsia="Arial" w:hAnsi="Arial"/>
+                <w:b w:val="false"/>
+                <w:bCs w:val="false"/>
+                <w:color w:val="1B1B1B"/>
+                <w:sz w:val="18"/>
+                <w:szCs w:val="18"/>
+              </w:rPr>
+              <w:t xml:space="preserve">Rate Noise Density</w:t>
+            </w:r>
+          </w:p>
+        </w:tc>
+        <w:tc>
+          <w:tcPr>
+            <w:tcW w:type="dxa" w:w="3080"/>
+            <w:tcMar>
+              <w:top w:type="dxa" w:w="60"/>
+              <w:left w:type="dxa" w:w="95"/>
+              <w:bottom w:type="dxa" w:w="60"/>
+              <w:right w:type="dxa" w:w="95"/>
+            </w:tcMar>
+            <w:vAlign w:val="center"/>
+          </w:tcPr>
+          <w:p>
+            <w:pPr>
+              <w:spacing w:after="0" w:line="265"/>
+            </w:pPr>
+            <w:r>
+              <w:rPr>
+                <w:rFonts w:ascii="Arial" w:cs="Arial" w:eastAsia="Arial" w:hAnsi="Arial"/>
+                <w:b w:val="false"/>
+                <w:bCs w:val="false"/>
+                <w:color w:val="1B1B1B"/>
+                <w:sz w:val="18"/>
+                <w:szCs w:val="18"/>
+              </w:rPr>
+              <w:t xml:space="preserve">雜訊密度</w:t>
+            </w:r>
+          </w:p>
+        </w:tc>
+        <w:tc>
+          <w:tcPr>
+            <w:tcW w:type="dxa" w:w="3080"/>
+            <w:tcMar>
+              <w:top w:type="dxa" w:w="60"/>
+              <w:left w:type="dxa" w:w="95"/>
+              <w:bottom w:type="dxa" w:w="60"/>
+              <w:right w:type="dxa" w:w="95"/>
+            </w:tcMar>
+            <w:vAlign w:val="center"/>
+          </w:tcPr>
+          <w:p>
+            <w:pPr>
+              <w:spacing w:after="0" w:line="265"/>
+            </w:pPr>
+            <w:r>
+              <w:rPr>
+                <w:rFonts w:ascii="Arial" w:cs="Arial" w:eastAsia="Arial" w:hAnsi="Arial"/>
+                <w:b w:val="false"/>
+                <w:bCs w:val="false"/>
+                <w:color w:val="1B1B1B"/>
+                <w:sz w:val="18"/>
+                <w:szCs w:val="18"/>
+              </w:rPr>
+              <w:t xml:space="preserve">Mật độ nhiễu</w:t>
             </w:r>
           </w:p>
         </w:tc>

</xml_diff>